<commit_message>
Russian and Kyrgyz CA Barometer
</commit_message>
<xml_diff>
--- a/data_topics/central_asia_barometer_1/CA_Barometer_1.docx
+++ b/data_topics/central_asia_barometer_1/CA_Barometer_1.docx
@@ -23,7 +23,7 @@
         <w:pStyle w:val="Date"/>
       </w:pPr>
       <w:r>
-        <w:t xml:space="preserve">2026-03-17</w:t>
+        <w:t xml:space="preserve">2026-03-31</w:t>
       </w:r>
     </w:p>
     <w:p>
@@ -534,7 +534,7 @@
     </w:p>
     <w:bookmarkEnd w:id="31"/>
     <w:bookmarkEnd w:id="32"/>
-    <w:bookmarkStart w:id="37" w:name="setup-and-preparing-data"/>
+    <w:bookmarkStart w:id="39" w:name="setup-and-preparing-data"/>
     <w:p>
       <w:pPr>
         <w:pStyle w:val="Heading1"/>
@@ -997,13 +997,13 @@
       </w:r>
     </w:p>
     <w:bookmarkEnd w:id="35"/>
-    <w:bookmarkStart w:id="36" w:name="python-support"/>
+    <w:bookmarkStart w:id="36" w:name="versions"/>
     <w:p>
       <w:pPr>
         <w:pStyle w:val="Heading2"/>
       </w:pPr>
       <w:r>
-        <w:t xml:space="preserve">3.2 Python support</w:t>
+        <w:t xml:space="preserve">3.2 Versions</w:t>
       </w:r>
     </w:p>
     <w:p>
@@ -1011,7 +1011,67 @@
         <w:pStyle w:val="FirstParagraph"/>
       </w:pPr>
       <w:r>
-        <w:t xml:space="preserve">Now let’s load reticulate (for Python support only). We must set the correct location of python corresponding to our system.</w:t>
+        <w:t xml:space="preserve">The links to the right provide alternate modes of accessing this content. You can choose Light or Dark mode HTML, a downloadable PDF, or a Word Docx format file all representing the same content. Code files with R (.R) or Python (.py) are also available, if you’d like to isolate the code from the description.</w:t>
+      </w:r>
+    </w:p>
+    <w:bookmarkEnd w:id="36"/>
+    <w:bookmarkStart w:id="37" w:name="kyrgyz-and-russian-language"/>
+    <w:p>
+      <w:pPr>
+        <w:pStyle w:val="Heading2"/>
+      </w:pPr>
+      <w:r>
+        <w:t xml:space="preserve">3.3 Kyrgyz and Russian language</w:t>
+      </w:r>
+    </w:p>
+    <w:p>
+      <w:pPr>
+        <w:pStyle w:val="FirstParagraph"/>
+      </w:pPr>
+      <w:r>
+        <w:t xml:space="preserve">Also, machine-translated versions of this content in Russian and Kyrgyz are linked on the right.</w:t>
+      </w:r>
+    </w:p>
+    <w:bookmarkEnd w:id="37"/>
+    <w:bookmarkStart w:id="38" w:name="python-support"/>
+    <w:p>
+      <w:pPr>
+        <w:pStyle w:val="Heading2"/>
+      </w:pPr>
+      <w:r>
+        <w:t xml:space="preserve">3.4 Python support</w:t>
+      </w:r>
+    </w:p>
+    <w:p>
+      <w:pPr>
+        <w:pStyle w:val="FirstParagraph"/>
+      </w:pPr>
+      <w:r>
+        <w:t xml:space="preserve">Now let’s load</w:t>
+      </w:r>
+      <w:r>
+        <w:t xml:space="preserve"> </w:t>
+      </w:r>
+      <w:r>
+        <w:rPr>
+          <w:i/>
+          <w:iCs/>
+        </w:rPr>
+        <w:t xml:space="preserve">reticulate</w:t>
+      </w:r>
+      <w:r>
+        <w:t xml:space="preserve"> </w:t>
+      </w:r>
+      <w:r>
+        <w:t xml:space="preserve">(for Python support only). We must set the correct location of python corresponding to our system.</w:t>
+      </w:r>
+    </w:p>
+    <w:p>
+      <w:pPr>
+        <w:pStyle w:val="BodyText"/>
+      </w:pPr>
+      <w:r>
+        <w:t xml:space="preserve">A Python file is provided for those who want to try out the same data steps in Python. Note that the Python file was machine-translated from R.</w:t>
       </w:r>
     </w:p>
     <w:p>
@@ -1067,9 +1127,9 @@
         <w:t xml:space="preserve">)</w:t>
       </w:r>
     </w:p>
-    <w:bookmarkEnd w:id="36"/>
-    <w:bookmarkEnd w:id="37"/>
-    <w:bookmarkStart w:id="42" w:name="central-asia-barometer"/>
+    <w:bookmarkEnd w:id="38"/>
+    <w:bookmarkEnd w:id="39"/>
+    <w:bookmarkStart w:id="44" w:name="central-asia-barometer"/>
     <w:p>
       <w:pPr>
         <w:pStyle w:val="Heading1"/>
@@ -1088,7 +1148,7 @@
       <w:r>
         <w:t xml:space="preserve"> </w:t>
       </w:r>
-      <w:hyperlink r:id="rId38">
+      <w:hyperlink r:id="rId40">
         <w:r>
           <w:rPr>
             <w:rStyle w:val="Hyperlink"/>
@@ -1111,7 +1171,7 @@
         <w:t xml:space="preserve">For this initial workshop, we will get familiar with the CA Barometer by looking at recent data (2022) for one country (Kyrgyzstan). The second workshop will extend and deepen our understanding by adding additional years and countries to our analysis, and explore more complex data manipulation and analysis.</w:t>
       </w:r>
     </w:p>
-    <w:bookmarkStart w:id="41" w:name="understanding-the-data"/>
+    <w:bookmarkStart w:id="43" w:name="understanding-the-data"/>
     <w:p>
       <w:pPr>
         <w:pStyle w:val="Heading2"/>
@@ -1138,7 +1198,7 @@
       <w:r>
         <w:t xml:space="preserve"> </w:t>
       </w:r>
-      <w:hyperlink r:id="rId39">
+      <w:hyperlink r:id="rId41">
         <w:r>
           <w:rPr>
             <w:rStyle w:val="Hyperlink"/>
@@ -1155,7 +1215,7 @@
       <w:r>
         <w:t xml:space="preserve"> </w:t>
       </w:r>
-      <w:hyperlink r:id="rId40">
+      <w:hyperlink r:id="rId42">
         <w:r>
           <w:rPr>
             <w:rStyle w:val="Hyperlink"/>
@@ -1170,9 +1230,9 @@
         <w:t xml:space="preserve">for that year.</w:t>
       </w:r>
     </w:p>
-    <w:bookmarkEnd w:id="41"/>
-    <w:bookmarkEnd w:id="42"/>
-    <w:bookmarkStart w:id="44" w:name="download-and-import-data"/>
+    <w:bookmarkEnd w:id="43"/>
+    <w:bookmarkEnd w:id="44"/>
+    <w:bookmarkStart w:id="46" w:name="download-and-import-data"/>
     <w:p>
       <w:pPr>
         <w:pStyle w:val="Heading1"/>
@@ -1191,7 +1251,7 @@
       <w:r>
         <w:t xml:space="preserve"> </w:t>
       </w:r>
-      <w:hyperlink r:id="rId38">
+      <w:hyperlink r:id="rId40">
         <w:r>
           <w:rPr>
             <w:rStyle w:val="Hyperlink"/>
@@ -1208,7 +1268,7 @@
       <w:r>
         <w:t xml:space="preserve"> </w:t>
       </w:r>
-      <w:hyperlink r:id="rId43">
+      <w:hyperlink r:id="rId45">
         <w:r>
           <w:rPr>
             <w:rStyle w:val="Hyperlink"/>
@@ -1511,8 +1571,8 @@
         <w:t xml:space="preserve">(mydata)</w:t>
       </w:r>
     </w:p>
-    <w:bookmarkEnd w:id="44"/>
-    <w:bookmarkStart w:id="51" w:name="data-wrangling"/>
+    <w:bookmarkEnd w:id="46"/>
+    <w:bookmarkStart w:id="53" w:name="data-wrangling"/>
     <w:p>
       <w:pPr>
         <w:pStyle w:val="Heading1"/>
@@ -1521,7 +1581,7 @@
         <w:t xml:space="preserve">6. Data Wrangling</w:t>
       </w:r>
     </w:p>
-    <w:bookmarkStart w:id="45" w:name="selection-and-naming"/>
+    <w:bookmarkStart w:id="47" w:name="selection-and-naming"/>
     <w:p>
       <w:pPr>
         <w:pStyle w:val="Heading2"/>
@@ -2134,8 +2194,8 @@
         <w:t xml:space="preserve">    MM4, MM5, MM6, MM7, MM8, MM9</w:t>
       </w:r>
     </w:p>
-    <w:bookmarkEnd w:id="45"/>
-    <w:bookmarkStart w:id="46" w:name="descriptive-statistics"/>
+    <w:bookmarkEnd w:id="47"/>
+    <w:bookmarkStart w:id="48" w:name="descriptive-statistics"/>
     <w:p>
       <w:pPr>
         <w:pStyle w:val="Heading2"/>
@@ -2842,8 +2902,8 @@
         <w:t xml:space="preserve">                32                163 </w:t>
       </w:r>
     </w:p>
-    <w:bookmarkEnd w:id="46"/>
-    <w:bookmarkStart w:id="50" w:name="recoding-data"/>
+    <w:bookmarkEnd w:id="48"/>
+    <w:bookmarkStart w:id="52" w:name="recoding-data"/>
     <w:p>
       <w:pPr>
         <w:pStyle w:val="Heading2"/>
@@ -3813,18 +3873,18 @@
           <wp:inline>
             <wp:extent cx="4620126" cy="3696101"/>
             <wp:effectExtent b="0" l="0" r="0" t="0"/>
-            <wp:docPr descr="" title="" id="48" name="Picture"/>
+            <wp:docPr descr="" title="" id="50" name="Picture"/>
             <a:graphic>
               <a:graphicData uri="http://schemas.openxmlformats.org/drawingml/2006/picture">
                 <pic:pic>
                   <pic:nvPicPr>
-                    <pic:cNvPr descr="CA_Barometer_1_files/figure-docx/Income_Numeric-1.png" id="49" name="Picture"/>
+                    <pic:cNvPr descr="CA_Barometer_1_files/figure-docx/Income_Numeric-1.png" id="51" name="Picture"/>
                     <pic:cNvPicPr>
                       <a:picLocks noChangeArrowheads="1" noChangeAspect="1"/>
                     </pic:cNvPicPr>
                   </pic:nvPicPr>
                   <pic:blipFill>
-                    <a:blip r:embed="rId47"/>
+                    <a:blip r:embed="rId49"/>
                     <a:stretch>
                       <a:fillRect/>
                     </a:stretch>
@@ -4150,9 +4210,9 @@
         <w:t xml:space="preserve">            23753.10             26208.06 </w:t>
       </w:r>
     </w:p>
-    <w:bookmarkEnd w:id="50"/>
-    <w:bookmarkEnd w:id="51"/>
-    <w:bookmarkStart w:id="68" w:name="plots---data-visualization"/>
+    <w:bookmarkEnd w:id="52"/>
+    <w:bookmarkEnd w:id="53"/>
+    <w:bookmarkStart w:id="70" w:name="plots---data-visualization"/>
     <w:p>
       <w:pPr>
         <w:pStyle w:val="Heading1"/>
@@ -4183,7 +4243,7 @@
         <w:rPr>
           <w:rStyle w:val="NormalTok"/>
         </w:rPr>
-        <w:t xml:space="preserve">(DD1,A3a)</w:t>
+        <w:t xml:space="preserve">(Sex,A3a)</w:t>
       </w:r>
     </w:p>
     <w:p>
@@ -4203,7 +4263,7 @@
         <w:rPr>
           <w:rStyle w:val="VerbatimChar"/>
         </w:rPr>
-        <w:t xml:space="preserve">DD1      Do not use chat rooms or messengers Don't Know (vol.) Other (vol.)</w:t>
+        <w:t xml:space="preserve">Sex      Do not use chat rooms or messengers Don't Know (vol.) Other (vol.)</w:t>
       </w:r>
       <w:r>
         <w:br/>
@@ -4239,7 +4299,7 @@
         <w:rPr>
           <w:rStyle w:val="VerbatimChar"/>
         </w:rPr>
-        <w:t xml:space="preserve">DD1      Telegram Viber WhatsApp</w:t>
+        <w:t xml:space="preserve">Sex      Telegram Viber WhatsApp</w:t>
       </w:r>
       <w:r>
         <w:br/>
@@ -5424,7 +5484,7 @@
         <w:t xml:space="preserve">    MM4, MM5, MM6, MM7, MM8, MM9</w:t>
       </w:r>
     </w:p>
-    <w:bookmarkStart w:id="67" w:name="illustrative-plots"/>
+    <w:bookmarkStart w:id="69" w:name="illustrative-plots"/>
     <w:p>
       <w:pPr>
         <w:pStyle w:val="Heading2"/>
@@ -5562,18 +5622,18 @@
           <wp:inline>
             <wp:extent cx="4620126" cy="3696101"/>
             <wp:effectExtent b="0" l="0" r="0" t="0"/>
-            <wp:docPr descr="" title="" id="53" name="Picture"/>
+            <wp:docPr descr="" title="" id="55" name="Picture"/>
             <a:graphic>
               <a:graphicData uri="http://schemas.openxmlformats.org/drawingml/2006/picture">
                 <pic:pic>
                   <pic:nvPicPr>
-                    <pic:cNvPr descr="CA_Barometer_1_files/figure-docx/illustrative%20plots-1.png" id="54" name="Picture"/>
+                    <pic:cNvPr descr="CA_Barometer_1_files/figure-docx/illustrative%20plots-1.png" id="56" name="Picture"/>
                     <pic:cNvPicPr>
                       <a:picLocks noChangeArrowheads="1" noChangeAspect="1"/>
                     </pic:cNvPicPr>
                   </pic:nvPicPr>
                   <pic:blipFill>
-                    <a:blip r:embed="rId52"/>
+                    <a:blip r:embed="rId54"/>
                     <a:stretch>
                       <a:fillRect/>
                     </a:stretch>
@@ -5712,18 +5772,18 @@
           <wp:inline>
             <wp:extent cx="4620126" cy="3696101"/>
             <wp:effectExtent b="0" l="0" r="0" t="0"/>
-            <wp:docPr descr="" title="" id="56" name="Picture"/>
+            <wp:docPr descr="" title="" id="58" name="Picture"/>
             <a:graphic>
               <a:graphicData uri="http://schemas.openxmlformats.org/drawingml/2006/picture">
                 <pic:pic>
                   <pic:nvPicPr>
-                    <pic:cNvPr descr="CA_Barometer_1_files/figure-docx/illustrative%20plots-2.png" id="57" name="Picture"/>
+                    <pic:cNvPr descr="CA_Barometer_1_files/figure-docx/illustrative%20plots-2.png" id="59" name="Picture"/>
                     <pic:cNvPicPr>
                       <a:picLocks noChangeArrowheads="1" noChangeAspect="1"/>
                     </pic:cNvPicPr>
                   </pic:nvPicPr>
                   <pic:blipFill>
-                    <a:blip r:embed="rId55"/>
+                    <a:blip r:embed="rId57"/>
                     <a:stretch>
                       <a:fillRect/>
                     </a:stretch>
@@ -5788,18 +5848,18 @@
           <wp:inline>
             <wp:extent cx="4620126" cy="3696101"/>
             <wp:effectExtent b="0" l="0" r="0" t="0"/>
-            <wp:docPr descr="" title="" id="59" name="Picture"/>
+            <wp:docPr descr="" title="" id="61" name="Picture"/>
             <a:graphic>
               <a:graphicData uri="http://schemas.openxmlformats.org/drawingml/2006/picture">
                 <pic:pic>
                   <pic:nvPicPr>
-                    <pic:cNvPr descr="CA_Barometer_1_files/figure-docx/illustrative%20plots-3.png" id="60" name="Picture"/>
+                    <pic:cNvPr descr="CA_Barometer_1_files/figure-docx/illustrative%20plots-3.png" id="62" name="Picture"/>
                     <pic:cNvPicPr>
                       <a:picLocks noChangeArrowheads="1" noChangeAspect="1"/>
                     </pic:cNvPicPr>
                   </pic:nvPicPr>
                   <pic:blipFill>
-                    <a:blip r:embed="rId58"/>
+                    <a:blip r:embed="rId60"/>
                     <a:stretch>
                       <a:fillRect/>
                     </a:stretch>
@@ -5864,18 +5924,18 @@
           <wp:inline>
             <wp:extent cx="4620126" cy="3696101"/>
             <wp:effectExtent b="0" l="0" r="0" t="0"/>
-            <wp:docPr descr="" title="" id="62" name="Picture"/>
+            <wp:docPr descr="" title="" id="64" name="Picture"/>
             <a:graphic>
               <a:graphicData uri="http://schemas.openxmlformats.org/drawingml/2006/picture">
                 <pic:pic>
                   <pic:nvPicPr>
-                    <pic:cNvPr descr="CA_Barometer_1_files/figure-docx/illustrative%20plots-4.png" id="63" name="Picture"/>
+                    <pic:cNvPr descr="CA_Barometer_1_files/figure-docx/illustrative%20plots-4.png" id="65" name="Picture"/>
                     <pic:cNvPicPr>
                       <a:picLocks noChangeArrowheads="1" noChangeAspect="1"/>
                     </pic:cNvPicPr>
                   </pic:nvPicPr>
                   <pic:blipFill>
-                    <a:blip r:embed="rId61"/>
+                    <a:blip r:embed="rId63"/>
                     <a:stretch>
                       <a:fillRect/>
                     </a:stretch>
@@ -6000,18 +6060,18 @@
           <wp:inline>
             <wp:extent cx="4620126" cy="3696101"/>
             <wp:effectExtent b="0" l="0" r="0" t="0"/>
-            <wp:docPr descr="" title="" id="65" name="Picture"/>
+            <wp:docPr descr="" title="" id="67" name="Picture"/>
             <a:graphic>
               <a:graphicData uri="http://schemas.openxmlformats.org/drawingml/2006/picture">
                 <pic:pic>
                   <pic:nvPicPr>
-                    <pic:cNvPr descr="CA_Barometer_1_files/figure-docx/illustrative%20plots-5.png" id="66" name="Picture"/>
+                    <pic:cNvPr descr="CA_Barometer_1_files/figure-docx/illustrative%20plots-5.png" id="68" name="Picture"/>
                     <pic:cNvPicPr>
                       <a:picLocks noChangeArrowheads="1" noChangeAspect="1"/>
                     </pic:cNvPicPr>
                   </pic:nvPicPr>
                   <pic:blipFill>
-                    <a:blip r:embed="rId64"/>
+                    <a:blip r:embed="rId66"/>
                     <a:stretch>
                       <a:fillRect/>
                     </a:stretch>
@@ -6038,376 +6098,376 @@
         </w:drawing>
       </w:r>
     </w:p>
-    <w:bookmarkEnd w:id="67"/>
-    <w:bookmarkEnd w:id="68"/>
-    <w:bookmarkStart w:id="70" w:name="further-statistical-analysis"/>
-    <w:p>
-      <w:pPr>
-        <w:pStyle w:val="Heading1"/>
-      </w:pPr>
-      <w:r>
-        <w:t xml:space="preserve">8. Further statistical analysis</w:t>
-      </w:r>
-    </w:p>
-    <w:bookmarkStart w:id="69" w:name="logistic-regresssion"/>
-    <w:p>
-      <w:pPr>
-        <w:pStyle w:val="Heading2"/>
-      </w:pPr>
-      <w:r>
-        <w:t xml:space="preserve">8.1 Logistic regresssion</w:t>
-      </w:r>
-    </w:p>
-    <w:p>
-      <w:pPr>
-        <w:pStyle w:val="FirstParagraph"/>
-      </w:pPr>
-      <w:r>
-        <w:t xml:space="preserve">As an example of statistical analysis, we can try a logistic regression to predict the answer to the right direction question. Logistic regression is the suitable method for when the outcome is a binary choice (yes/no, true/false, right/wrong).</w:t>
-      </w:r>
-    </w:p>
-    <w:p>
-      <w:pPr>
-        <w:pStyle w:val="SourceCode"/>
-      </w:pPr>
-      <w:r>
-        <w:rPr>
-          <w:rStyle w:val="NormalTok"/>
-        </w:rPr>
-        <w:t xml:space="preserve">logistic_output </w:t>
-      </w:r>
-      <w:r>
-        <w:rPr>
-          <w:rStyle w:val="OtherTok"/>
-        </w:rPr>
-        <w:t xml:space="preserve">&lt;-</w:t>
-      </w:r>
-      <w:r>
-        <w:rPr>
-          <w:rStyle w:val="NormalTok"/>
-        </w:rPr>
-        <w:t xml:space="preserve"> </w:t>
-      </w:r>
-      <w:r>
-        <w:rPr>
-          <w:rStyle w:val="FunctionTok"/>
-        </w:rPr>
-        <w:t xml:space="preserve">glm</w:t>
-      </w:r>
-      <w:r>
-        <w:rPr>
-          <w:rStyle w:val="NormalTok"/>
-        </w:rPr>
-        <w:t xml:space="preserve">(D1_recode </w:t>
-      </w:r>
-      <w:r>
-        <w:rPr>
-          <w:rStyle w:val="SpecialCharTok"/>
-        </w:rPr>
-        <w:t xml:space="preserve">~</w:t>
-      </w:r>
-      <w:r>
-        <w:rPr>
-          <w:rStyle w:val="NormalTok"/>
-        </w:rPr>
-        <w:t xml:space="preserve"> Sex </w:t>
-      </w:r>
-      <w:r>
-        <w:rPr>
-          <w:rStyle w:val="SpecialCharTok"/>
-        </w:rPr>
-        <w:t xml:space="preserve">+</w:t>
-      </w:r>
-      <w:r>
-        <w:rPr>
-          <w:rStyle w:val="NormalTok"/>
-        </w:rPr>
-        <w:t xml:space="preserve"> Language </w:t>
-      </w:r>
-      <w:r>
-        <w:rPr>
-          <w:rStyle w:val="SpecialCharTok"/>
-        </w:rPr>
-        <w:t xml:space="preserve">+</w:t>
-      </w:r>
-      <w:r>
-        <w:rPr>
-          <w:rStyle w:val="NormalTok"/>
-        </w:rPr>
-        <w:t xml:space="preserve"> Income_Numeric, </w:t>
-      </w:r>
-      <w:r>
-        <w:rPr>
-          <w:rStyle w:val="AttributeTok"/>
-        </w:rPr>
-        <w:t xml:space="preserve">family=</w:t>
-      </w:r>
-      <w:r>
-        <w:rPr>
-          <w:rStyle w:val="NormalTok"/>
-        </w:rPr>
-        <w:t xml:space="preserve">binomial, </w:t>
-      </w:r>
-      <w:r>
-        <w:rPr>
-          <w:rStyle w:val="AttributeTok"/>
-        </w:rPr>
-        <w:t xml:space="preserve">data=</w:t>
-      </w:r>
-      <w:r>
-        <w:rPr>
-          <w:rStyle w:val="NormalTok"/>
-        </w:rPr>
-        <w:t xml:space="preserve">mydata)</w:t>
-      </w:r>
-      <w:r>
-        <w:br/>
-      </w:r>
-      <w:r>
-        <w:rPr>
-          <w:rStyle w:val="FunctionTok"/>
-        </w:rPr>
-        <w:t xml:space="preserve">summary</w:t>
-      </w:r>
-      <w:r>
-        <w:rPr>
-          <w:rStyle w:val="NormalTok"/>
-        </w:rPr>
-        <w:t xml:space="preserve">(logistic_output)</w:t>
-      </w:r>
-    </w:p>
-    <w:p>
-      <w:pPr>
-        <w:pStyle w:val="SourceCode"/>
-      </w:pPr>
-      <w:r>
-        <w:br/>
-      </w:r>
-      <w:r>
-        <w:rPr>
-          <w:rStyle w:val="VerbatimChar"/>
-        </w:rPr>
-        <w:t xml:space="preserve">Call:</w:t>
-      </w:r>
-      <w:r>
-        <w:br/>
-      </w:r>
-      <w:r>
-        <w:rPr>
-          <w:rStyle w:val="VerbatimChar"/>
-        </w:rPr>
-        <w:t xml:space="preserve">glm(formula = D1_recode ~ Sex + Language + Income_Numeric, family = binomial, </w:t>
-      </w:r>
-      <w:r>
-        <w:br/>
-      </w:r>
-      <w:r>
-        <w:rPr>
-          <w:rStyle w:val="VerbatimChar"/>
-        </w:rPr>
-        <w:t xml:space="preserve">    data = mydata)</w:t>
-      </w:r>
-      <w:r>
-        <w:br/>
-      </w:r>
-      <w:r>
-        <w:br/>
-      </w:r>
-      <w:r>
-        <w:rPr>
-          <w:rStyle w:val="VerbatimChar"/>
-        </w:rPr>
-        <w:t xml:space="preserve">Coefficients:</w:t>
-      </w:r>
-      <w:r>
-        <w:br/>
-      </w:r>
-      <w:r>
-        <w:rPr>
-          <w:rStyle w:val="VerbatimChar"/>
-        </w:rPr>
-        <w:t xml:space="preserve">                       Estimate Std. Error z value Pr(&gt;|z|)   </w:t>
-      </w:r>
-      <w:r>
-        <w:br/>
-      </w:r>
-      <w:r>
-        <w:rPr>
-          <w:rStyle w:val="VerbatimChar"/>
-        </w:rPr>
-        <w:t xml:space="preserve">(Intercept)          -1.504e+01  8.827e+02  -0.017  0.98641   </w:t>
-      </w:r>
-      <w:r>
-        <w:br/>
-      </w:r>
-      <w:r>
-        <w:rPr>
-          <w:rStyle w:val="VerbatimChar"/>
-        </w:rPr>
-        <w:t xml:space="preserve">SexMale               3.881e-01  1.688e-01   2.298  0.02154 * </w:t>
-      </w:r>
-      <w:r>
-        <w:br/>
-      </w:r>
-      <w:r>
-        <w:rPr>
-          <w:rStyle w:val="VerbatimChar"/>
-        </w:rPr>
-        <w:t xml:space="preserve">LanguageKazakh       -2.200e-01  1.248e+03   0.000  0.99986   </w:t>
-      </w:r>
-      <w:r>
-        <w:br/>
-      </w:r>
-      <w:r>
-        <w:rPr>
-          <w:rStyle w:val="VerbatimChar"/>
-        </w:rPr>
-        <w:t xml:space="preserve">LanguageKyrgyz        1.246e+01  8.827e+02   0.014  0.98874   </w:t>
-      </w:r>
-      <w:r>
-        <w:br/>
-      </w:r>
-      <w:r>
-        <w:rPr>
-          <w:rStyle w:val="VerbatimChar"/>
-        </w:rPr>
-        <w:t xml:space="preserve">LanguageOther (vol.)  1.258e+01  8.827e+02   0.014  0.98863   </w:t>
-      </w:r>
-      <w:r>
-        <w:br/>
-      </w:r>
-      <w:r>
-        <w:rPr>
-          <w:rStyle w:val="VerbatimChar"/>
-        </w:rPr>
-        <w:t xml:space="preserve">LanguageRussian       1.390e+01  8.827e+02   0.016  0.98744   </w:t>
-      </w:r>
-      <w:r>
-        <w:br/>
-      </w:r>
-      <w:r>
-        <w:rPr>
-          <w:rStyle w:val="VerbatimChar"/>
-        </w:rPr>
-        <w:t xml:space="preserve">LanguageTajik         6.654e-02  1.248e+03   0.000  0.99996   </w:t>
-      </w:r>
-      <w:r>
-        <w:br/>
-      </w:r>
-      <w:r>
-        <w:rPr>
-          <w:rStyle w:val="VerbatimChar"/>
-        </w:rPr>
-        <w:t xml:space="preserve">LanguageTurkmen      -4.101e-01  1.080e+03   0.000  0.99970   </w:t>
-      </w:r>
-      <w:r>
-        <w:br/>
-      </w:r>
-      <w:r>
-        <w:rPr>
-          <w:rStyle w:val="VerbatimChar"/>
-        </w:rPr>
-        <w:t xml:space="preserve">LanguageUzbek         1.178e+01  8.827e+02   0.013  0.98935   </w:t>
-      </w:r>
-      <w:r>
-        <w:br/>
-      </w:r>
-      <w:r>
-        <w:rPr>
-          <w:rStyle w:val="VerbatimChar"/>
-        </w:rPr>
-        <w:t xml:space="preserve">Income_Numeric        1.692e-05  6.179e-06   2.739  0.00617 **</w:t>
-      </w:r>
-      <w:r>
-        <w:br/>
-      </w:r>
-      <w:r>
-        <w:rPr>
-          <w:rStyle w:val="VerbatimChar"/>
-        </w:rPr>
-        <w:t xml:space="preserve">---</w:t>
-      </w:r>
-      <w:r>
-        <w:br/>
-      </w:r>
-      <w:r>
-        <w:rPr>
-          <w:rStyle w:val="VerbatimChar"/>
-        </w:rPr>
-        <w:t xml:space="preserve">Signif. codes:  0 '***' 0.001 '**' 0.01 '*' 0.05 '.' 0.1 ' ' 1</w:t>
-      </w:r>
-      <w:r>
-        <w:br/>
-      </w:r>
-      <w:r>
-        <w:br/>
-      </w:r>
-      <w:r>
-        <w:rPr>
-          <w:rStyle w:val="VerbatimChar"/>
-        </w:rPr>
-        <w:t xml:space="preserve">(Dispersion parameter for binomial family taken to be 1)</w:t>
-      </w:r>
-      <w:r>
-        <w:br/>
-      </w:r>
-      <w:r>
-        <w:br/>
-      </w:r>
-      <w:r>
-        <w:rPr>
-          <w:rStyle w:val="VerbatimChar"/>
-        </w:rPr>
-        <w:t xml:space="preserve">    Null deviance: 1042.64  on 1243  degrees of freedom</w:t>
-      </w:r>
-      <w:r>
-        <w:br/>
-      </w:r>
-      <w:r>
-        <w:rPr>
-          <w:rStyle w:val="VerbatimChar"/>
-        </w:rPr>
-        <w:t xml:space="preserve">Residual deviance:  983.01  on 1234  degrees of freedom</w:t>
-      </w:r>
-      <w:r>
-        <w:br/>
-      </w:r>
-      <w:r>
-        <w:rPr>
-          <w:rStyle w:val="VerbatimChar"/>
-        </w:rPr>
-        <w:t xml:space="preserve">  (274 observations deleted due to missingness)</w:t>
-      </w:r>
-      <w:r>
-        <w:br/>
-      </w:r>
-      <w:r>
-        <w:rPr>
-          <w:rStyle w:val="VerbatimChar"/>
-        </w:rPr>
-        <w:t xml:space="preserve">AIC: 1003</w:t>
-      </w:r>
-      <w:r>
-        <w:br/>
-      </w:r>
-      <w:r>
-        <w:br/>
-      </w:r>
-      <w:r>
-        <w:rPr>
-          <w:rStyle w:val="VerbatimChar"/>
-        </w:rPr>
-        <w:t xml:space="preserve">Number of Fisher Scoring iterations: 13</w:t>
-      </w:r>
-    </w:p>
     <w:bookmarkEnd w:id="69"/>
     <w:bookmarkEnd w:id="70"/>
-    <w:bookmarkStart w:id="71" w:name="other-possibilities"/>
+    <w:bookmarkStart w:id="72" w:name="further-statistical-analysis"/>
     <w:p>
       <w:pPr>
         <w:pStyle w:val="Heading1"/>
       </w:pPr>
       <w:r>
+        <w:t xml:space="preserve">8. Further statistical analysis</w:t>
+      </w:r>
+    </w:p>
+    <w:bookmarkStart w:id="71" w:name="logistic-regresssion"/>
+    <w:p>
+      <w:pPr>
+        <w:pStyle w:val="Heading2"/>
+      </w:pPr>
+      <w:r>
+        <w:t xml:space="preserve">8.1 Logistic regresssion</w:t>
+      </w:r>
+    </w:p>
+    <w:p>
+      <w:pPr>
+        <w:pStyle w:val="FirstParagraph"/>
+      </w:pPr>
+      <w:r>
+        <w:t xml:space="preserve">As an example of statistical analysis, we can try a logistic regression to predict the answer to the right direction question. Logistic regression is the suitable method for when the outcome is a binary choice (yes/no, true/false, right/wrong).</w:t>
+      </w:r>
+    </w:p>
+    <w:p>
+      <w:pPr>
+        <w:pStyle w:val="SourceCode"/>
+      </w:pPr>
+      <w:r>
+        <w:rPr>
+          <w:rStyle w:val="NormalTok"/>
+        </w:rPr>
+        <w:t xml:space="preserve">logistic_output </w:t>
+      </w:r>
+      <w:r>
+        <w:rPr>
+          <w:rStyle w:val="OtherTok"/>
+        </w:rPr>
+        <w:t xml:space="preserve">&lt;-</w:t>
+      </w:r>
+      <w:r>
+        <w:rPr>
+          <w:rStyle w:val="NormalTok"/>
+        </w:rPr>
+        <w:t xml:space="preserve"> </w:t>
+      </w:r>
+      <w:r>
+        <w:rPr>
+          <w:rStyle w:val="FunctionTok"/>
+        </w:rPr>
+        <w:t xml:space="preserve">glm</w:t>
+      </w:r>
+      <w:r>
+        <w:rPr>
+          <w:rStyle w:val="NormalTok"/>
+        </w:rPr>
+        <w:t xml:space="preserve">(D1_recode </w:t>
+      </w:r>
+      <w:r>
+        <w:rPr>
+          <w:rStyle w:val="SpecialCharTok"/>
+        </w:rPr>
+        <w:t xml:space="preserve">~</w:t>
+      </w:r>
+      <w:r>
+        <w:rPr>
+          <w:rStyle w:val="NormalTok"/>
+        </w:rPr>
+        <w:t xml:space="preserve"> Sex </w:t>
+      </w:r>
+      <w:r>
+        <w:rPr>
+          <w:rStyle w:val="SpecialCharTok"/>
+        </w:rPr>
+        <w:t xml:space="preserve">+</w:t>
+      </w:r>
+      <w:r>
+        <w:rPr>
+          <w:rStyle w:val="NormalTok"/>
+        </w:rPr>
+        <w:t xml:space="preserve"> Language </w:t>
+      </w:r>
+      <w:r>
+        <w:rPr>
+          <w:rStyle w:val="SpecialCharTok"/>
+        </w:rPr>
+        <w:t xml:space="preserve">+</w:t>
+      </w:r>
+      <w:r>
+        <w:rPr>
+          <w:rStyle w:val="NormalTok"/>
+        </w:rPr>
+        <w:t xml:space="preserve"> Income_Numeric, </w:t>
+      </w:r>
+      <w:r>
+        <w:rPr>
+          <w:rStyle w:val="AttributeTok"/>
+        </w:rPr>
+        <w:t xml:space="preserve">family=</w:t>
+      </w:r>
+      <w:r>
+        <w:rPr>
+          <w:rStyle w:val="NormalTok"/>
+        </w:rPr>
+        <w:t xml:space="preserve">binomial, </w:t>
+      </w:r>
+      <w:r>
+        <w:rPr>
+          <w:rStyle w:val="AttributeTok"/>
+        </w:rPr>
+        <w:t xml:space="preserve">data=</w:t>
+      </w:r>
+      <w:r>
+        <w:rPr>
+          <w:rStyle w:val="NormalTok"/>
+        </w:rPr>
+        <w:t xml:space="preserve">mydata)</w:t>
+      </w:r>
+      <w:r>
+        <w:br/>
+      </w:r>
+      <w:r>
+        <w:rPr>
+          <w:rStyle w:val="FunctionTok"/>
+        </w:rPr>
+        <w:t xml:space="preserve">summary</w:t>
+      </w:r>
+      <w:r>
+        <w:rPr>
+          <w:rStyle w:val="NormalTok"/>
+        </w:rPr>
+        <w:t xml:space="preserve">(logistic_output)</w:t>
+      </w:r>
+    </w:p>
+    <w:p>
+      <w:pPr>
+        <w:pStyle w:val="SourceCode"/>
+      </w:pPr>
+      <w:r>
+        <w:br/>
+      </w:r>
+      <w:r>
+        <w:rPr>
+          <w:rStyle w:val="VerbatimChar"/>
+        </w:rPr>
+        <w:t xml:space="preserve">Call:</w:t>
+      </w:r>
+      <w:r>
+        <w:br/>
+      </w:r>
+      <w:r>
+        <w:rPr>
+          <w:rStyle w:val="VerbatimChar"/>
+        </w:rPr>
+        <w:t xml:space="preserve">glm(formula = D1_recode ~ Sex + Language + Income_Numeric, family = binomial, </w:t>
+      </w:r>
+      <w:r>
+        <w:br/>
+      </w:r>
+      <w:r>
+        <w:rPr>
+          <w:rStyle w:val="VerbatimChar"/>
+        </w:rPr>
+        <w:t xml:space="preserve">    data = mydata)</w:t>
+      </w:r>
+      <w:r>
+        <w:br/>
+      </w:r>
+      <w:r>
+        <w:br/>
+      </w:r>
+      <w:r>
+        <w:rPr>
+          <w:rStyle w:val="VerbatimChar"/>
+        </w:rPr>
+        <w:t xml:space="preserve">Coefficients:</w:t>
+      </w:r>
+      <w:r>
+        <w:br/>
+      </w:r>
+      <w:r>
+        <w:rPr>
+          <w:rStyle w:val="VerbatimChar"/>
+        </w:rPr>
+        <w:t xml:space="preserve">                       Estimate Std. Error z value Pr(&gt;|z|)   </w:t>
+      </w:r>
+      <w:r>
+        <w:br/>
+      </w:r>
+      <w:r>
+        <w:rPr>
+          <w:rStyle w:val="VerbatimChar"/>
+        </w:rPr>
+        <w:t xml:space="preserve">(Intercept)          -1.504e+01  8.827e+02  -0.017  0.98641   </w:t>
+      </w:r>
+      <w:r>
+        <w:br/>
+      </w:r>
+      <w:r>
+        <w:rPr>
+          <w:rStyle w:val="VerbatimChar"/>
+        </w:rPr>
+        <w:t xml:space="preserve">SexMale               3.881e-01  1.688e-01   2.298  0.02154 * </w:t>
+      </w:r>
+      <w:r>
+        <w:br/>
+      </w:r>
+      <w:r>
+        <w:rPr>
+          <w:rStyle w:val="VerbatimChar"/>
+        </w:rPr>
+        <w:t xml:space="preserve">LanguageKazakh       -2.200e-01  1.248e+03   0.000  0.99986   </w:t>
+      </w:r>
+      <w:r>
+        <w:br/>
+      </w:r>
+      <w:r>
+        <w:rPr>
+          <w:rStyle w:val="VerbatimChar"/>
+        </w:rPr>
+        <w:t xml:space="preserve">LanguageKyrgyz        1.246e+01  8.827e+02   0.014  0.98874   </w:t>
+      </w:r>
+      <w:r>
+        <w:br/>
+      </w:r>
+      <w:r>
+        <w:rPr>
+          <w:rStyle w:val="VerbatimChar"/>
+        </w:rPr>
+        <w:t xml:space="preserve">LanguageOther (vol.)  1.258e+01  8.827e+02   0.014  0.98863   </w:t>
+      </w:r>
+      <w:r>
+        <w:br/>
+      </w:r>
+      <w:r>
+        <w:rPr>
+          <w:rStyle w:val="VerbatimChar"/>
+        </w:rPr>
+        <w:t xml:space="preserve">LanguageRussian       1.390e+01  8.827e+02   0.016  0.98744   </w:t>
+      </w:r>
+      <w:r>
+        <w:br/>
+      </w:r>
+      <w:r>
+        <w:rPr>
+          <w:rStyle w:val="VerbatimChar"/>
+        </w:rPr>
+        <w:t xml:space="preserve">LanguageTajik         6.654e-02  1.248e+03   0.000  0.99996   </w:t>
+      </w:r>
+      <w:r>
+        <w:br/>
+      </w:r>
+      <w:r>
+        <w:rPr>
+          <w:rStyle w:val="VerbatimChar"/>
+        </w:rPr>
+        <w:t xml:space="preserve">LanguageTurkmen      -4.101e-01  1.080e+03   0.000  0.99970   </w:t>
+      </w:r>
+      <w:r>
+        <w:br/>
+      </w:r>
+      <w:r>
+        <w:rPr>
+          <w:rStyle w:val="VerbatimChar"/>
+        </w:rPr>
+        <w:t xml:space="preserve">LanguageUzbek         1.178e+01  8.827e+02   0.013  0.98935   </w:t>
+      </w:r>
+      <w:r>
+        <w:br/>
+      </w:r>
+      <w:r>
+        <w:rPr>
+          <w:rStyle w:val="VerbatimChar"/>
+        </w:rPr>
+        <w:t xml:space="preserve">Income_Numeric        1.692e-05  6.179e-06   2.739  0.00617 **</w:t>
+      </w:r>
+      <w:r>
+        <w:br/>
+      </w:r>
+      <w:r>
+        <w:rPr>
+          <w:rStyle w:val="VerbatimChar"/>
+        </w:rPr>
+        <w:t xml:space="preserve">---</w:t>
+      </w:r>
+      <w:r>
+        <w:br/>
+      </w:r>
+      <w:r>
+        <w:rPr>
+          <w:rStyle w:val="VerbatimChar"/>
+        </w:rPr>
+        <w:t xml:space="preserve">Signif. codes:  0 '***' 0.001 '**' 0.01 '*' 0.05 '.' 0.1 ' ' 1</w:t>
+      </w:r>
+      <w:r>
+        <w:br/>
+      </w:r>
+      <w:r>
+        <w:br/>
+      </w:r>
+      <w:r>
+        <w:rPr>
+          <w:rStyle w:val="VerbatimChar"/>
+        </w:rPr>
+        <w:t xml:space="preserve">(Dispersion parameter for binomial family taken to be 1)</w:t>
+      </w:r>
+      <w:r>
+        <w:br/>
+      </w:r>
+      <w:r>
+        <w:br/>
+      </w:r>
+      <w:r>
+        <w:rPr>
+          <w:rStyle w:val="VerbatimChar"/>
+        </w:rPr>
+        <w:t xml:space="preserve">    Null deviance: 1042.64  on 1243  degrees of freedom</w:t>
+      </w:r>
+      <w:r>
+        <w:br/>
+      </w:r>
+      <w:r>
+        <w:rPr>
+          <w:rStyle w:val="VerbatimChar"/>
+        </w:rPr>
+        <w:t xml:space="preserve">Residual deviance:  983.01  on 1234  degrees of freedom</w:t>
+      </w:r>
+      <w:r>
+        <w:br/>
+      </w:r>
+      <w:r>
+        <w:rPr>
+          <w:rStyle w:val="VerbatimChar"/>
+        </w:rPr>
+        <w:t xml:space="preserve">  (274 observations deleted due to missingness)</w:t>
+      </w:r>
+      <w:r>
+        <w:br/>
+      </w:r>
+      <w:r>
+        <w:rPr>
+          <w:rStyle w:val="VerbatimChar"/>
+        </w:rPr>
+        <w:t xml:space="preserve">AIC: 1003</w:t>
+      </w:r>
+      <w:r>
+        <w:br/>
+      </w:r>
+      <w:r>
+        <w:br/>
+      </w:r>
+      <w:r>
+        <w:rPr>
+          <w:rStyle w:val="VerbatimChar"/>
+        </w:rPr>
+        <w:t xml:space="preserve">Number of Fisher Scoring iterations: 13</w:t>
+      </w:r>
+    </w:p>
+    <w:bookmarkEnd w:id="71"/>
+    <w:bookmarkEnd w:id="72"/>
+    <w:bookmarkStart w:id="73" w:name="other-possibilities"/>
+    <w:p>
+      <w:pPr>
+        <w:pStyle w:val="Heading1"/>
+      </w:pPr>
+      <w:r>
         <w:t xml:space="preserve">9. Other possibilities</w:t>
       </w:r>
     </w:p>
@@ -6424,7 +6484,23 @@
         <w:pStyle w:val="BodyText"/>
       </w:pPr>
       <w:r>
-        <w:t xml:space="preserve">b13 - russians in area - interesting vs region</w:t>
+        <w:t xml:space="preserve">Question B13 -</w:t>
+      </w:r>
+      <w:r>
+        <w:t xml:space="preserve"> </w:t>
+      </w:r>
+      <w:r>
+        <w:rPr>
+          <w:i/>
+          <w:iCs/>
+        </w:rPr>
+        <w:t xml:space="preserve">“Have Russians been emigrating to your area?”</w:t>
+      </w:r>
+      <w:r>
+        <w:t xml:space="preserve"> </w:t>
+      </w:r>
+      <w:r>
+        <w:t xml:space="preserve">could be analyzed by region</w:t>
       </w:r>
     </w:p>
     <w:p>
@@ -6432,7 +6508,23 @@
         <w:pStyle w:val="BodyText"/>
       </w:pPr>
       <w:r>
-        <w:t xml:space="preserve">e17 how long with conflict with Ukr last (2022 survey , interesting)</w:t>
+        <w:t xml:space="preserve">Question E17 -</w:t>
+      </w:r>
+      <w:r>
+        <w:t xml:space="preserve"> </w:t>
+      </w:r>
+      <w:r>
+        <w:rPr>
+          <w:i/>
+          <w:iCs/>
+        </w:rPr>
+        <w:t xml:space="preserve">“How long will conflict with Ukraine last?”</w:t>
+      </w:r>
+      <w:r>
+        <w:t xml:space="preserve"> </w:t>
+      </w:r>
+      <w:r>
+        <w:t xml:space="preserve">asked in 2022</w:t>
       </w:r>
     </w:p>
     <w:p>
@@ -6440,11 +6532,27 @@
         <w:pStyle w:val="BodyText"/>
       </w:pPr>
       <w:r>
-        <w:t xml:space="preserve">g3b general presidential favorability - breakdowns</w:t>
-      </w:r>
-    </w:p>
-    <w:bookmarkEnd w:id="71"/>
-    <w:bookmarkStart w:id="77" w:name="conclusion"/>
+        <w:t xml:space="preserve">Question G3b -</w:t>
+      </w:r>
+      <w:r>
+        <w:t xml:space="preserve"> </w:t>
+      </w:r>
+      <w:r>
+        <w:rPr>
+          <w:i/>
+          <w:iCs/>
+        </w:rPr>
+        <w:t xml:space="preserve">“Attitude toward President Japarov?”</w:t>
+      </w:r>
+      <w:r>
+        <w:t xml:space="preserve"> </w:t>
+      </w:r>
+      <w:r>
+        <w:t xml:space="preserve">what breakdowns would be interesting here?</w:t>
+      </w:r>
+    </w:p>
+    <w:bookmarkEnd w:id="73"/>
+    <w:bookmarkStart w:id="80" w:name="conclusion"/>
     <w:p>
       <w:pPr>
         <w:pStyle w:val="Heading1"/>
@@ -6458,7 +6566,21 @@
         <w:pStyle w:val="FirstParagraph"/>
       </w:pPr>
       <w:r>
-        <w:t xml:space="preserve">There is no one stopping point for data analysis. Keep going until you have a full understanding of the data and its interaction with the questions you seek to answer. The second part of this workshop series will illustrate more advanced methods and combinations of data.</w:t>
+        <w:t xml:space="preserve">There is no one stopping point for data analysis. Keep going until you have a full understanding of the data and its interaction with the questions you seek to answer. The second part of this workshop series,</w:t>
+      </w:r>
+      <w:r>
+        <w:t xml:space="preserve"> </w:t>
+      </w:r>
+      <w:hyperlink r:id="rId74">
+        <w:r>
+          <w:rPr>
+            <w:rStyle w:val="Hyperlink"/>
+          </w:rPr>
+          <w:t xml:space="preserve">Central Asia Barometer 2</w:t>
+        </w:r>
+      </w:hyperlink>
+      <w:r>
+        <w:t xml:space="preserve">, will illustrate more advanced methods and combinations of data.</w:t>
       </w:r>
     </w:p>
     <w:p>
@@ -6471,7 +6593,7 @@
       <w:r>
         <w:t xml:space="preserve"> </w:t>
       </w:r>
-      <w:hyperlink r:id="rId72">
+      <w:hyperlink r:id="rId75">
         <w:r>
           <w:rPr>
             <w:rStyle w:val="Hyperlink"/>
@@ -6488,7 +6610,7 @@
       <w:r>
         <w:t xml:space="preserve"> </w:t>
       </w:r>
-      <w:hyperlink r:id="rId73">
+      <w:hyperlink r:id="rId76">
         <w:r>
           <w:rPr>
             <w:rStyle w:val="Hyperlink"/>
@@ -6503,7 +6625,7 @@
         <w:t xml:space="preserve">for further discussion of data analysis techniques.</w:t>
       </w:r>
     </w:p>
-    <w:bookmarkStart w:id="76" w:name="r-for-data-science"/>
+    <w:bookmarkStart w:id="79" w:name="r-for-data-science"/>
     <w:p>
       <w:pPr>
         <w:pStyle w:val="Heading2"/>
@@ -6522,7 +6644,7 @@
       <w:r>
         <w:t xml:space="preserve"> </w:t>
       </w:r>
-      <w:hyperlink r:id="rId74">
+      <w:hyperlink r:id="rId77">
         <w:r>
           <w:rPr>
             <w:rStyle w:val="Hyperlink"/>
@@ -6539,7 +6661,7 @@
       <w:r>
         <w:t xml:space="preserve"> </w:t>
       </w:r>
-      <w:hyperlink r:id="rId75">
+      <w:hyperlink r:id="rId78">
         <w:r>
           <w:rPr>
             <w:rStyle w:val="Hyperlink"/>
@@ -6554,8 +6676,8 @@
         <w:t xml:space="preserve">a collection of packages for modeling and machine learning using tidyverse principles.</w:t>
       </w:r>
     </w:p>
-    <w:bookmarkEnd w:id="76"/>
-    <w:bookmarkEnd w:id="77"/>
+    <w:bookmarkEnd w:id="79"/>
+    <w:bookmarkEnd w:id="80"/>
     <w:sectPr>
       <w:footnotePr>
         <w:numRestart w:val="eachSect"/>

</xml_diff>